<commit_message>
chore: update progress date to 3 September 2026
</commit_message>
<xml_diff>
--- a/docs/Panduan_Presentasi_ERD_dan_Fitur_BrightDor.docx
+++ b/docs/Panduan_Presentasi_ERD_dan_Fitur_BrightDor.docx
@@ -29,7 +29,7 @@
           <w:color w:val="5A5054"/>
           <w:sz w:val="22"/>
         </w:rPr>
-        <w:t>BrightDor Premier Wedding Marketplace — Progress 10 September 2026</w:t>
+        <w:t>BrightDor Premier Wedding Marketplace — Progress 3 September 2026</w:t>
         <w:br/>
         <w:t>Disusun Khusus Sebagai Contekan &amp; Panduan Menghadapi Dosen Penguji</w:t>
       </w:r>
@@ -513,7 +513,7 @@
           <w:color w:val="8E1B37"/>
           <w:sz w:val="28"/>
         </w:rPr>
-        <w:t>5. KEAMANAN &amp; STRATEGI HOSTING (SESUAI ARAHAN TANGGAL 10)</w:t>
+        <w:t>5. KEAMANAN &amp; STRATEGI HOSTING (SESUAI ARAHAN 3 SEPTEMBER 2026)</w:t>
       </w:r>
     </w:p>
     <w:p>

</xml_diff>